<commit_message>
fix(s1): short situation choice and direct S6–S12 route; subcontractor/customer roles (#269)
Detailed 16-question check becomes optional (S1); S0 is a short choice of
six situations with an explicit start step and path. Overdue payment goes
S6→S12 without S2–S5, including unreconciled balances via the settlement
register. Buyer files name the parties Субподрядчик and Заказчик; the oral
agreement sentence is replaced with the approved wording. Five new checks
fail on the previous candidate and pass here; LibreOffice layer reports
ПРОПУСК when only libreoffice-core is installed.

BUILD CANDIDATE / NO PUBLIC LAUNCH. LEGAL_REVIEW_REQUIRED unchanged.

Co-Authored-By: Claude Opus 5.5 <noreply@anthropic.com>
Claude-Session: https://claude.ai/code/session_01UmCUuQToGDpJHXok26LuA6
</commit_message>
<xml_diff>
--- a/tools/candidates/s1-oplata-za-raboty/01-karta-situacii-i-granic.docx
+++ b/tools/candidates/s1-oplata-za-raboty/01-karta-situacii-i-granic.docx
@@ -15,7 +15,7 @@
         <w:rPr>
           <w:i/>
         </w:rPr>
-        <w:t>Файл 01. Определяет, подходит ли ваша ситуация для системы, с какого шага начинать и где система останавливается.</w:t>
+        <w:t>Файл 01. Выбор исходной ситуации, стартовый шаг и путь по ней, границы системы.</w:t>
       </w:r>
     </w:p>
     <w:p>
@@ -50,7 +50,7 @@
         <w:pStyle w:val="ListNumber"/>
       </w:pPr>
       <w:r>
-        <w:t>Ответьте на вопросы в файле 02, лист «Маршрут». Итог маршрута показывается автоматически.</w:t>
+        <w:t>Найдите в таблице 1 одну строку, которая описывает вашу ситуацию.</w:t>
       </w:r>
     </w:p>
     <w:p>
@@ -58,7 +58,7 @@
         <w:pStyle w:val="ListNumber"/>
       </w:pPr>
       <w:r>
-        <w:t>Найдите свою ситуацию в таблице 1 и начните с указанного шага.</w:t>
+        <w:t>Начните со стартового шага этой строки в файле 03 и идите по указанному пути. Шаги, которых нет в пути, не проходите.</w:t>
       </w:r>
     </w:p>
     <w:p>
@@ -66,7 +66,15 @@
         <w:pStyle w:val="ListNumber"/>
       </w:pPr>
       <w:r>
-        <w:t>Если итог называет границу B1–B4 — действуйте по строке этой границы в таблице 2. Бесспорную часть долга, не затронутую границей, можно вести по системе дальше.</w:t>
+        <w:t>Если есть признаки границы B1–B4 — действуйте по строке этой границы в таблице 2. Бесспорную часть долга, не затронутую границей, можно вести по системе дальше.</w:t>
+      </w:r>
+    </w:p>
+    <w:p>
+      <w:pPr>
+        <w:pStyle w:val="ListNumber"/>
+      </w:pPr>
+      <w:r>
+        <w:t>Сомневаетесь в выборе — по желанию пройдите детальную проверку в файле 02, лист «Маршрут». Для выбора ситуации она не обязательна.</w:t>
       </w:r>
     </w:p>
     <w:p>
@@ -74,7 +82,7 @@
         <w:pStyle w:val="Heading1"/>
       </w:pPr>
       <w:r>
-        <w:t>Таблица 1. Исходная ситуация → маршрут</w:t>
+        <w:t>Таблица 1. Исходная ситуация → стартовый шаг → путь</w:t>
       </w:r>
     </w:p>
     <w:tbl>
@@ -102,7 +110,7 @@
               <w:rPr>
                 <w:b/>
               </w:rPr>
-              <w:t>№</w:t>
+              <w:t>Ситуация</w:t>
             </w:r>
           </w:p>
         </w:tc>
@@ -116,7 +124,7 @@
               <w:rPr>
                 <w:b/>
               </w:rPr>
-              <w:t>Исходная ситуация</w:t>
+              <w:t>Как узнать</w:t>
             </w:r>
           </w:p>
         </w:tc>
@@ -130,7 +138,7 @@
               <w:rPr>
                 <w:b/>
               </w:rPr>
-              <w:t>Что подтверждает документами</w:t>
+              <w:t>Стартовый шаг</w:t>
             </w:r>
           </w:p>
         </w:tc>
@@ -144,7 +152,7 @@
               <w:rPr>
                 <w:b/>
               </w:rPr>
-              <w:t>Маршрут</w:t>
+              <w:t>Путь (шаги)</w:t>
             </w:r>
           </w:p>
         </w:tc>
@@ -158,7 +166,7 @@
               <w:rPr>
                 <w:b/>
               </w:rPr>
-              <w:t>Файлы</w:t>
+              <w:t>Следующий шаг после стартового</w:t>
             </w:r>
           </w:p>
         </w:tc>
@@ -170,7 +178,7 @@
           </w:tcPr>
           <w:p>
             <w:r>
-              <w:t>1</w:t>
+              <w:t>А. Оплата просрочена, долг подтверждён</w:t>
             </w:r>
           </w:p>
         </w:tc>
@@ -180,7 +188,7 @@
           </w:tcPr>
           <w:p>
             <w:r>
-              <w:t>Работы приняты, акт подписан обеими сторонами, срок оплаты истёк, сумма сверена</w:t>
+              <w:t>Работы приняты, КС-2/КС-3 (или акт по договору) подписаны обеими сторонами, задолженность подтверждена актом сверки или реестром взаиморасчётов, срок оплаты истёк.</w:t>
             </w:r>
           </w:p>
         </w:tc>
@@ -190,7 +198,7 @@
           </w:tcPr>
           <w:p>
             <w:r>
-              <w:t>Подписанные КС-2/КС-3 или акт; акт сверки или реестр взаиморасчётов; платёжки</w:t>
+              <w:t>Шаг 6</w:t>
             </w:r>
           </w:p>
         </w:tc>
@@ -200,7 +208,7 @@
           </w:tcPr>
           <w:p>
             <w:r>
-              <w:t>Основной маршрут: шаги 0–1 для проверки, затем 6–12</w:t>
+              <w:t>6 → 7 → 8 → 9 → 10 → 11 → 12</w:t>
             </w:r>
           </w:p>
         </w:tc>
@@ -210,7 +218,7 @@
           </w:tcPr>
           <w:p>
             <w:r>
-              <w:t>02 → 08 → 11</w:t>
+              <w:t>шаг 7</w:t>
             </w:r>
           </w:p>
         </w:tc>
@@ -222,7 +230,7 @@
           </w:tcPr>
           <w:p>
             <w:r>
-              <w:t>2</w:t>
+              <w:t>Б. Оплата просрочена, взаиморасчёты не сверены</w:t>
             </w:r>
           </w:p>
         </w:tc>
@@ -232,7 +240,7 @@
           </w:tcPr>
           <w:p>
             <w:r>
-              <w:t>Работы приняты, но сумма долга не сверена: были авансы, частичные оплаты</w:t>
+              <w:t>Работы приняты, акты подписаны обеими сторонами, срок оплаты истёк, но сумма долга не сверена: были авансы, частичные оплаты, акта сверки нет.</w:t>
             </w:r>
           </w:p>
         </w:tc>
@@ -242,7 +250,7 @@
           </w:tcPr>
           <w:p>
             <w:r>
-              <w:t>Подписанные акты есть, акта сверки нет</w:t>
+              <w:t>Шаг 6</w:t>
             </w:r>
           </w:p>
         </w:tc>
@@ -252,7 +260,7 @@
           </w:tcPr>
           <w:p>
             <w:r>
-              <w:t>Шаг 6: сначала реестр взаиморасчётов</w:t>
+              <w:t>6 → 7 → 8 → 9 → 10 → 11 → 12</w:t>
             </w:r>
           </w:p>
         </w:tc>
@@ -262,7 +270,7 @@
           </w:tcPr>
           <w:p>
             <w:r>
-              <w:t>08, лист «Взаиморасчёты»</w:t>
+              <w:t>шаг 7</w:t>
             </w:r>
           </w:p>
         </w:tc>
@@ -274,7 +282,7 @@
           </w:tcPr>
           <w:p>
             <w:r>
-              <w:t>3</w:t>
+              <w:t>В. Оплата просрочена, заказчик прислал гарантийное письмо</w:t>
             </w:r>
           </w:p>
         </w:tc>
@@ -284,7 +292,7 @@
           </w:tcPr>
           <w:p>
             <w:r>
-              <w:t>Работы выполнены, закрывающие документы ещё не оформлены или не переданы</w:t>
+              <w:t>Работы приняты, долг подтверждён, срок оплаты истёк; заказчик письмом назвал новую дату оплаты, двустороннего соглашения нет.</w:t>
             </w:r>
           </w:p>
         </w:tc>
@@ -294,7 +302,7 @@
           </w:tcPr>
           <w:p>
             <w:r>
-              <w:t>Нет подписанного акта; нет доказательства передачи</w:t>
+              <w:t>Шаг 6</w:t>
             </w:r>
           </w:p>
         </w:tc>
@@ -304,7 +312,7 @@
           </w:tcPr>
           <w:p>
             <w:r>
-              <w:t>Шаги 2–5, затем 6</w:t>
+              <w:t>6 → 7 → 8 → 9 → 10 → 11 → 12</w:t>
             </w:r>
           </w:p>
         </w:tc>
@@ -314,7 +322,7 @@
           </w:tcPr>
           <w:p>
             <w:r>
-              <w:t>04–07, 09, 10</w:t>
+              <w:t>шаг 7</w:t>
             </w:r>
           </w:p>
         </w:tc>
@@ -326,7 +334,7 @@
           </w:tcPr>
           <w:p>
             <w:r>
-              <w:t>4</w:t>
+              <w:t>Г. Документы не оформлены или не переданы</w:t>
             </w:r>
           </w:p>
         </w:tc>
@@ -336,7 +344,7 @@
           </w:tcPr>
           <w:p>
             <w:r>
-              <w:t>Документы переданы, пришли устранимые или документальные замечания</w:t>
+              <w:t>Работы выполнены, но акта, подписанного обеими сторонами, нет, либо нет доказательства, что документы переданы заказчику.</w:t>
             </w:r>
           </w:p>
         </w:tc>
@@ -346,7 +354,49 @@
           </w:tcPr>
           <w:p>
             <w:r>
-              <w:t>Письмо с замечаниями, возврат комплекта</w:t>
+              <w:t>Шаг 2</w:t>
+            </w:r>
+          </w:p>
+        </w:tc>
+        <w:tc>
+          <w:tcPr>
+            <w:tcW w:type="dxa" w:w="1728"/>
+          </w:tcPr>
+          <w:p>
+            <w:r>
+              <w:t>2 → 3 → 4 → 5 → 6 → 7 → 8 → 9 → 10 → 11 → 12</w:t>
+            </w:r>
+          </w:p>
+        </w:tc>
+        <w:tc>
+          <w:tcPr>
+            <w:tcW w:type="dxa" w:w="1728"/>
+          </w:tcPr>
+          <w:p>
+            <w:r>
+              <w:t>шаг 3</w:t>
+            </w:r>
+          </w:p>
+        </w:tc>
+      </w:tr>
+      <w:tr>
+        <w:tc>
+          <w:tcPr>
+            <w:tcW w:type="dxa" w:w="1728"/>
+          </w:tcPr>
+          <w:p>
+            <w:r>
+              <w:t>Д. Документы переданы, есть устранимые замечания</w:t>
+            </w:r>
+          </w:p>
+        </w:tc>
+        <w:tc>
+          <w:tcPr>
+            <w:tcW w:type="dxa" w:w="1728"/>
+          </w:tcPr>
+          <w:p>
+            <w:r>
+              <w:t>Документы переданы с доказательством, заказчик вернул их с устранимыми или документальными замечаниями.</w:t>
             </w:r>
           </w:p>
         </w:tc>
@@ -366,7 +416,17 @@
           </w:tcPr>
           <w:p>
             <w:r>
-              <w:t>10, раздел Б; 08, «Реестр замечаний»</w:t>
+              <w:t>5 → 6 → 7 → 8 → 9 → 10 → 11 → 12</w:t>
+            </w:r>
+          </w:p>
+        </w:tc>
+        <w:tc>
+          <w:tcPr>
+            <w:tcW w:type="dxa" w:w="1728"/>
+          </w:tcPr>
+          <w:p>
+            <w:r>
+              <w:t>шаг 6</w:t>
             </w:r>
           </w:p>
         </w:tc>
@@ -378,7 +438,7 @@
           </w:tcPr>
           <w:p>
             <w:r>
-              <w:t>5</w:t>
+              <w:t>Е. Документы переданы, заказчик не подписывает и не отвечает</w:t>
             </w:r>
           </w:p>
         </w:tc>
@@ -388,7 +448,7 @@
           </w:tcPr>
           <w:p>
             <w:r>
-              <w:t>Документы переданы, заказчик не подписывает и не отвечает</w:t>
+              <w:t>Доказательство передачи есть, подписи и ответа заказчика нет, мотивированного отказа нет.</w:t>
             </w:r>
           </w:p>
         </w:tc>
@@ -398,7 +458,7 @@
           </w:tcPr>
           <w:p>
             <w:r>
-              <w:t>Доказательство передачи есть, подписи нет</w:t>
+              <w:t>Шаг 4</w:t>
             </w:r>
           </w:p>
         </w:tc>
@@ -408,7 +468,7 @@
           </w:tcPr>
           <w:p>
             <w:r>
-              <w:t>Шаг 4: зафиксировать получение и срок приёмки по договору; при отказе — граница B4</w:t>
+              <w:t>4 → 5 → 6 → 7 → 8 → 9 → 10 → 11 → 12</w:t>
             </w:r>
           </w:p>
         </w:tc>
@@ -418,169 +478,22 @@
           </w:tcPr>
           <w:p>
             <w:r>
-              <w:t>10; 08, «Реестр передачи»</w:t>
-            </w:r>
-          </w:p>
-        </w:tc>
-      </w:tr>
-      <w:tr>
-        <w:tc>
-          <w:tcPr>
-            <w:tcW w:type="dxa" w:w="1728"/>
-          </w:tcPr>
-          <w:p>
-            <w:r>
-              <w:t>6</w:t>
-            </w:r>
-          </w:p>
-        </w:tc>
-        <w:tc>
-          <w:tcPr>
-            <w:tcW w:type="dxa" w:w="1728"/>
-          </w:tcPr>
-          <w:p>
-            <w:r>
-              <w:t>Срок оплаты перенесён двусторонним соглашением</w:t>
-            </w:r>
-          </w:p>
-        </w:tc>
-        <w:tc>
-          <w:tcPr>
-            <w:tcW w:type="dxa" w:w="1728"/>
-          </w:tcPr>
-          <w:p>
-            <w:r>
-              <w:t>Подписанное обеими сторонами соглашение</w:t>
-            </w:r>
-          </w:p>
-        </w:tc>
-        <w:tc>
-          <w:tcPr>
-            <w:tcW w:type="dxa" w:w="1728"/>
-          </w:tcPr>
-          <w:p>
-            <w:r>
-              <w:t>Новая дата вносится в файл 02; маршрут с шага 6 после её истечения</w:t>
-            </w:r>
-          </w:p>
-        </w:tc>
-        <w:tc>
-          <w:tcPr>
-            <w:tcW w:type="dxa" w:w="1728"/>
-          </w:tcPr>
-          <w:p>
-            <w:r>
-              <w:t>11, раздел Б; 02</w:t>
-            </w:r>
-          </w:p>
-        </w:tc>
-      </w:tr>
-      <w:tr>
-        <w:tc>
-          <w:tcPr>
-            <w:tcW w:type="dxa" w:w="1728"/>
-          </w:tcPr>
-          <w:p>
-            <w:r>
-              <w:t>7</w:t>
-            </w:r>
-          </w:p>
-        </w:tc>
-        <w:tc>
-          <w:tcPr>
-            <w:tcW w:type="dxa" w:w="1728"/>
-          </w:tcPr>
-          <w:p>
-            <w:r>
-              <w:t>Заказчик прислал гарантийное письмо с новой датой оплаты</w:t>
-            </w:r>
-          </w:p>
-        </w:tc>
-        <w:tc>
-          <w:tcPr>
-            <w:tcW w:type="dxa" w:w="1728"/>
-          </w:tcPr>
-          <w:p>
-            <w:r>
-              <w:t>Одностороннее письмо заказчика</w:t>
-            </w:r>
-          </w:p>
-        </w:tc>
-        <w:tc>
-          <w:tcPr>
-            <w:tcW w:type="dxa" w:w="1728"/>
-          </w:tcPr>
-          <w:p>
-            <w:r>
-              <w:t>Шаг 7: письмо не переносит договорный срок; предложить соглашение</w:t>
-            </w:r>
-          </w:p>
-        </w:tc>
-        <w:tc>
-          <w:tcPr>
-            <w:tcW w:type="dxa" w:w="1728"/>
-          </w:tcPr>
-          <w:p>
-            <w:r>
-              <w:t>11, раздел В</w:t>
-            </w:r>
-          </w:p>
-        </w:tc>
-      </w:tr>
-      <w:tr>
-        <w:tc>
-          <w:tcPr>
-            <w:tcW w:type="dxa" w:w="1728"/>
-          </w:tcPr>
-          <w:p>
-            <w:r>
-              <w:t>8</w:t>
-            </w:r>
-          </w:p>
-        </w:tc>
-        <w:tc>
-          <w:tcPr>
-            <w:tcW w:type="dxa" w:w="1728"/>
-          </w:tcPr>
-          <w:p>
-            <w:r>
-              <w:t>Срок оплаты ещё не наступил или договор его не определяет</w:t>
-            </w:r>
-          </w:p>
-        </w:tc>
-        <w:tc>
-          <w:tcPr>
-            <w:tcW w:type="dxa" w:w="1728"/>
-          </w:tcPr>
-          <w:p>
-            <w:r>
-              <w:t>Нет даты или она в будущем</w:t>
-            </w:r>
-          </w:p>
-        </w:tc>
-        <w:tc>
-          <w:tcPr>
-            <w:tcW w:type="dxa" w:w="1728"/>
-          </w:tcPr>
-          <w:p>
-            <w:r>
-              <w:t>РАНО: вести шаги 2–5; если срок не определён — к специалисту</w:t>
-            </w:r>
-          </w:p>
-        </w:tc>
-        <w:tc>
-          <w:tcPr>
-            <w:tcW w:type="dxa" w:w="1728"/>
-          </w:tcPr>
-          <w:p>
-            <w:r>
-              <w:t>02; 04–10</w:t>
+              <w:t>шаг 5</w:t>
             </w:r>
           </w:p>
         </w:tc>
       </w:tr>
     </w:tbl>
     <w:p/>
+    <w:p>
+      <w:r>
+        <w:rPr>
+          <w:b w:val="0"/>
+          <w:i/>
+        </w:rPr>
+        <w:t>Срок оплаты ещё не истёк или договор его не определяет: маршрут начните на следующий день после срока; документы до этого можно готовить по ситуации «Г». Если договор срок оплаты не определяет — дату начала просрочки определите со специалистом.</w:t>
+      </w:r>
+    </w:p>
     <w:p>
       <w:pPr>
         <w:pStyle w:val="Heading1"/>
@@ -812,7 +725,7 @@
           </w:tcPr>
           <w:p>
             <w:r>
-              <w:t>Заказчик направил мотивированный отказ от приёмки; акт подписан только подрядчиком; объём или качество требуют экспертизы; оспаривается подпись или полномочия подписанта.</w:t>
+              <w:t>Заказчик направил мотивированный отказ от приёмки; акт подписан только субподрядчиком; объём или качество требуют экспертизы; оспаривается подпись или полномочия подписанта.</w:t>
             </w:r>
           </w:p>
         </w:tc>
@@ -1023,7 +936,7 @@
           </w:tcPr>
           <w:p>
             <w:r>
-              <w:t>Маршрутизация по исходной ситуации и границы системы</w:t>
+              <w:t>Выбор исходной ситуации, маршрут по ней и границы системы</w:t>
             </w:r>
           </w:p>
         </w:tc>
@@ -1045,7 +958,7 @@
           </w:tcPr>
           <w:p>
             <w:r>
-              <w:t>Первичная проверка, карта рисков, контроль ответа заказчика</w:t>
+              <w:t>Детальная проверка по желанию, карта рисков, дата просрочки, контроль ответа заказчика</w:t>
             </w:r>
           </w:p>
         </w:tc>

</xml_diff>

<commit_message>
MB001 #327: separate disputed debt and verify printable reconciliation candidate
</commit_message>
<xml_diff>
--- a/tools/candidates/s1-oplata-za-raboty/01-karta-situacii-i-granic.docx
+++ b/tools/candidates/s1-oplata-za-raboty/01-karta-situacii-i-granic.docx
@@ -724,7 +724,7 @@
               <w:rPr>
                 <w:sz w:val="18"/>
               </w:rPr>
-              <w:t>Внесите каждую операцию в реестр взаиморасчётов с типом «Удержание», «Зачёт» или «Неустойка заявлена». Бесспорную часть долга можно вести по S1 дальше; спорную часть с документами передайте специалисту до направления претензии.</w:t>
+              <w:t>Внесите каждую операцию в файл 04, лист «Взаиморасчёты», с типом «Удержание», «Зачёт встречного требования» или «Неустойка заявлена» и с актом, к которому она относится. Общий долг она не уменьшает: её сумма показывается отдельно как спорная часть. В расчёт процентов и претензию идёт только бесспорная часть — её можно вести по S1 дальше; спорную часть с документами передайте специалисту до направления претензии.</w:t>
             </w:r>
           </w:p>
         </w:tc>
@@ -886,7 +886,7 @@
               <w:rPr>
                 <w:sz w:val="18"/>
               </w:rPr>
-              <w:t>Суммы по допработам, которые заказчик не подписал, не вносите в реестр взаиморасчётов как начисление по акту: эти работы не приняты. Если допработы вошли в подписанный акт, эта часть долга спорная: в расчёт процентов и претензию её без оценки специалиста не включайте. Бесспорную часть долга ведите по маршруту дальше. По допработам соберите договор, смету, переписку о поручении работ и акты и передайте специалисту по описи (файл 10, раздел В).</w:t>
+              <w:t>Суммы по допработам, которые заказчик не подписал, не вносите в реестр взаиморасчётов как начисление по акту: эти работы не приняты. Если допработы вошли в подписанный акт, эта часть долга спорная: внесите её в файл 04, лист «Взаиморасчёты», операцией «Допработы без соглашения (спорно)» с актом — она попадёт в спорную часть и в расчёт процентов и претензию без оценки специалиста не войдёт. Бесспорную часть долга ведите по маршруту дальше. По допработам соберите договор, смету, переписку о поручении работ и акты и передайте специалисту по описи (файл 10, раздел В).</w:t>
             </w:r>
           </w:p>
         </w:tc>
@@ -1428,7 +1428,7 @@
           </w:tcPr>
           <w:p>
             <w:r>
-              <w:t>Взаиморасчёты, долг по актам, реестр передачи ваших отправлений, реестр приложений</w:t>
+              <w:t>Взаиморасчёты: общий долг, спорная и бесспорная части раздельно; долг по актам, акт сверки, реестр передачи ваших отправлений, реестр приложений</w:t>
             </w:r>
           </w:p>
         </w:tc>
@@ -1516,7 +1516,7 @@
           </w:tcPr>
           <w:p>
             <w:r>
-              <w:t>Расчёт процентов по ст. 395 ГК РФ: несколько актов в одном расчёте (до 12), у каждого своя дата начала просрочки и свои оплаты; итог — только при статусе «ГОТОВ»</w:t>
+              <w:t>Расчёт процентов по ст. 395 ГК РФ: несколько актов в одном расчёте (до 12), у каждого своя дата начала просрочки и свои оплаты; проценты только на бесспорную часть; итог — только при статусе «ГОТОВ»</w:t>
             </w:r>
           </w:p>
         </w:tc>
@@ -1538,7 +1538,7 @@
           </w:tcPr>
           <w:p>
             <w:r>
-              <w:t>Претензия об оплате принятых работ: долг, проценты, приложения</w:t>
+              <w:t>Претензия об оплате принятых работ: бесспорный долг, проценты, приложения</w:t>
             </w:r>
           </w:p>
         </w:tc>

</xml_diff>

<commit_message>
fix(s1): keep table rows and compact reference tables readable
</commit_message>
<xml_diff>
--- a/tools/candidates/s1-oplata-za-raboty/01-karta-situacii-i-granic.docx
+++ b/tools/candidates/s1-oplata-za-raboty/01-karta-situacii-i-granic.docx
@@ -116,11 +116,18 @@
         <w:gridCol w:w="2268"/>
       </w:tblGrid>
       <w:tr>
+        <w:trPr>
+          <w:cantSplit/>
+          <w:tblHeader/>
+        </w:trPr>
         <w:tc>
           <w:tcPr>
             <w:tcW w:type="dxa" w:w="1928"/>
           </w:tcPr>
           <w:p>
+            <w:pPr>
+              <w:keepNext/>
+            </w:pPr>
             <w:r/>
             <w:r>
               <w:rPr>
@@ -135,6 +142,9 @@
             <w:tcW w:type="dxa" w:w="2948"/>
           </w:tcPr>
           <w:p>
+            <w:pPr>
+              <w:keepNext/>
+            </w:pPr>
             <w:r/>
             <w:r>
               <w:rPr>
@@ -149,6 +159,9 @@
             <w:tcW w:type="dxa" w:w="1474"/>
           </w:tcPr>
           <w:p>
+            <w:pPr>
+              <w:keepNext/>
+            </w:pPr>
             <w:r/>
             <w:r>
               <w:rPr>
@@ -163,6 +176,9 @@
             <w:tcW w:type="dxa" w:w="2268"/>
           </w:tcPr>
           <w:p>
+            <w:pPr>
+              <w:keepNext/>
+            </w:pPr>
             <w:r/>
             <w:r>
               <w:rPr>
@@ -174,6 +190,9 @@
         </w:tc>
       </w:tr>
       <w:tr>
+        <w:trPr>
+          <w:cantSplit/>
+        </w:trPr>
         <w:tc>
           <w:tcPr>
             <w:tcW w:type="dxa" w:w="1928"/>
@@ -216,6 +235,9 @@
         </w:tc>
       </w:tr>
       <w:tr>
+        <w:trPr>
+          <w:cantSplit/>
+        </w:trPr>
         <w:tc>
           <w:tcPr>
             <w:tcW w:type="dxa" w:w="1928"/>
@@ -258,6 +280,9 @@
         </w:tc>
       </w:tr>
       <w:tr>
+        <w:trPr>
+          <w:cantSplit/>
+        </w:trPr>
         <w:tc>
           <w:tcPr>
             <w:tcW w:type="dxa" w:w="1928"/>
@@ -300,6 +325,9 @@
         </w:tc>
       </w:tr>
       <w:tr>
+        <w:trPr>
+          <w:cantSplit/>
+        </w:trPr>
         <w:tc>
           <w:tcPr>
             <w:tcW w:type="dxa" w:w="1928"/>
@@ -415,11 +443,18 @@
         <w:gridCol w:w="5669"/>
       </w:tblGrid>
       <w:tr>
+        <w:trPr>
+          <w:cantSplit/>
+          <w:tblHeader/>
+        </w:trPr>
         <w:tc>
           <w:tcPr>
             <w:tcW w:type="dxa" w:w="2948"/>
           </w:tcPr>
           <w:p>
+            <w:pPr>
+              <w:keepNext/>
+            </w:pPr>
             <w:r/>
             <w:r>
               <w:rPr>
@@ -434,6 +469,9 @@
             <w:tcW w:type="dxa" w:w="5669"/>
           </w:tcPr>
           <w:p>
+            <w:pPr>
+              <w:keepNext/>
+            </w:pPr>
             <w:r/>
             <w:r>
               <w:rPr>
@@ -445,6 +483,9 @@
         </w:tc>
       </w:tr>
       <w:tr>
+        <w:trPr>
+          <w:cantSplit/>
+        </w:trPr>
         <w:tc>
           <w:tcPr>
             <w:tcW w:type="dxa" w:w="2948"/>
@@ -467,6 +508,9 @@
         </w:tc>
       </w:tr>
       <w:tr>
+        <w:trPr>
+          <w:cantSplit/>
+        </w:trPr>
         <w:tc>
           <w:tcPr>
             <w:tcW w:type="dxa" w:w="2948"/>
@@ -489,6 +533,9 @@
         </w:tc>
       </w:tr>
       <w:tr>
+        <w:trPr>
+          <w:cantSplit/>
+        </w:trPr>
         <w:tc>
           <w:tcPr>
             <w:tcW w:type="dxa" w:w="2948"/>
@@ -544,11 +591,18 @@
         <w:gridCol w:w="2721"/>
       </w:tblGrid>
       <w:tr>
+        <w:trPr>
+          <w:cantSplit/>
+          <w:tblHeader/>
+        </w:trPr>
         <w:tc>
           <w:tcPr>
             <w:tcW w:type="dxa" w:w="1701"/>
           </w:tcPr>
           <w:p>
+            <w:pPr>
+              <w:keepNext/>
+            </w:pPr>
             <w:r>
               <w:rPr>
                 <w:sz w:val="18"/>
@@ -568,6 +622,9 @@
             <w:tcW w:type="dxa" w:w="2268"/>
           </w:tcPr>
           <w:p>
+            <w:pPr>
+              <w:keepNext/>
+            </w:pPr>
             <w:r>
               <w:rPr>
                 <w:sz w:val="18"/>
@@ -587,6 +644,9 @@
             <w:tcW w:type="dxa" w:w="1928"/>
           </w:tcPr>
           <w:p>
+            <w:pPr>
+              <w:keepNext/>
+            </w:pPr>
             <w:r>
               <w:rPr>
                 <w:sz w:val="18"/>
@@ -606,6 +666,9 @@
             <w:tcW w:type="dxa" w:w="2721"/>
           </w:tcPr>
           <w:p>
+            <w:pPr>
+              <w:keepNext/>
+            </w:pPr>
             <w:r>
               <w:rPr>
                 <w:sz w:val="18"/>
@@ -622,6 +685,9 @@
         </w:tc>
       </w:tr>
       <w:tr>
+        <w:trPr>
+          <w:cantSplit/>
+        </w:trPr>
         <w:tc>
           <w:tcPr>
             <w:tcW w:type="dxa" w:w="1701"/>
@@ -676,6 +742,9 @@
         </w:tc>
       </w:tr>
       <w:tr>
+        <w:trPr>
+          <w:cantSplit/>
+        </w:trPr>
         <w:tc>
           <w:tcPr>
             <w:tcW w:type="dxa" w:w="1701"/>
@@ -730,6 +799,9 @@
         </w:tc>
       </w:tr>
       <w:tr>
+        <w:trPr>
+          <w:cantSplit/>
+        </w:trPr>
         <w:tc>
           <w:tcPr>
             <w:tcW w:type="dxa" w:w="1701"/>
@@ -784,6 +856,9 @@
         </w:tc>
       </w:tr>
       <w:tr>
+        <w:trPr>
+          <w:cantSplit/>
+        </w:trPr>
         <w:tc>
           <w:tcPr>
             <w:tcW w:type="dxa" w:w="1701"/>
@@ -838,6 +913,9 @@
         </w:tc>
       </w:tr>
       <w:tr>
+        <w:trPr>
+          <w:cantSplit/>
+        </w:trPr>
         <w:tc>
           <w:tcPr>
             <w:tcW w:type="dxa" w:w="1701"/>
@@ -924,11 +1002,18 @@
         <w:gridCol w:w="1814"/>
       </w:tblGrid>
       <w:tr>
+        <w:trPr>
+          <w:cantSplit/>
+          <w:tblHeader/>
+        </w:trPr>
         <w:tc>
           <w:tcPr>
             <w:tcW w:type="dxa" w:w="3969"/>
           </w:tcPr>
           <w:p>
+            <w:pPr>
+              <w:keepNext/>
+            </w:pPr>
             <w:r/>
             <w:r>
               <w:rPr>
@@ -943,6 +1028,9 @@
             <w:tcW w:type="dxa" w:w="2835"/>
           </w:tcPr>
           <w:p>
+            <w:pPr>
+              <w:keepNext/>
+            </w:pPr>
             <w:r/>
             <w:r>
               <w:rPr>
@@ -957,6 +1045,9 @@
             <w:tcW w:type="dxa" w:w="1814"/>
           </w:tcPr>
           <w:p>
+            <w:pPr>
+              <w:keepNext/>
+            </w:pPr>
             <w:r/>
             <w:r>
               <w:rPr>
@@ -968,6 +1059,9 @@
         </w:tc>
       </w:tr>
       <w:tr>
+        <w:trPr>
+          <w:cantSplit/>
+        </w:trPr>
         <w:tc>
           <w:tcPr>
             <w:tcW w:type="dxa" w:w="3969"/>
@@ -1000,6 +1094,9 @@
         </w:tc>
       </w:tr>
       <w:tr>
+        <w:trPr>
+          <w:cantSplit/>
+        </w:trPr>
         <w:tc>
           <w:tcPr>
             <w:tcW w:type="dxa" w:w="3969"/>
@@ -1032,6 +1129,9 @@
         </w:tc>
       </w:tr>
       <w:tr>
+        <w:trPr>
+          <w:cantSplit/>
+        </w:trPr>
         <w:tc>
           <w:tcPr>
             <w:tcW w:type="dxa" w:w="3969"/>
@@ -1064,6 +1164,9 @@
         </w:tc>
       </w:tr>
       <w:tr>
+        <w:trPr>
+          <w:cantSplit/>
+        </w:trPr>
         <w:tc>
           <w:tcPr>
             <w:tcW w:type="dxa" w:w="3969"/>
@@ -1096,6 +1199,9 @@
         </w:tc>
       </w:tr>
       <w:tr>
+        <w:trPr>
+          <w:cantSplit/>
+        </w:trPr>
         <w:tc>
           <w:tcPr>
             <w:tcW w:type="dxa" w:w="3969"/>
@@ -1128,6 +1234,9 @@
         </w:tc>
       </w:tr>
       <w:tr>
+        <w:trPr>
+          <w:cantSplit/>
+        </w:trPr>
         <w:tc>
           <w:tcPr>
             <w:tcW w:type="dxa" w:w="3969"/>
@@ -1294,11 +1403,18 @@
         <w:gridCol w:w="5102"/>
       </w:tblGrid>
       <w:tr>
+        <w:trPr>
+          <w:cantSplit/>
+          <w:tblHeader/>
+        </w:trPr>
         <w:tc>
           <w:tcPr>
             <w:tcW w:type="dxa" w:w="3515"/>
           </w:tcPr>
           <w:p>
+            <w:pPr>
+              <w:keepNext/>
+            </w:pPr>
             <w:r/>
             <w:r>
               <w:rPr>
@@ -1313,6 +1429,9 @@
             <w:tcW w:type="dxa" w:w="5102"/>
           </w:tcPr>
           <w:p>
+            <w:pPr>
+              <w:keepNext/>
+            </w:pPr>
             <w:r/>
             <w:r>
               <w:rPr>
@@ -1324,11 +1443,17 @@
         </w:tc>
       </w:tr>
       <w:tr>
+        <w:trPr>
+          <w:cantSplit/>
+        </w:trPr>
         <w:tc>
           <w:tcPr>
             <w:tcW w:type="dxa" w:w="3515"/>
           </w:tcPr>
           <w:p>
+            <w:pPr>
+              <w:keepNext/>
+            </w:pPr>
             <w:r>
               <w:t>00-START-HERE.txt</w:t>
             </w:r>
@@ -1339,6 +1464,9 @@
             <w:tcW w:type="dxa" w:w="5102"/>
           </w:tcPr>
           <w:p>
+            <w:pPr>
+              <w:keepNext/>
+            </w:pPr>
             <w:r>
               <w:t>С чего начать: подходит ли система, выбор ситуации, первый шаг</w:t>
             </w:r>
@@ -1346,11 +1474,17 @@
         </w:tc>
       </w:tr>
       <w:tr>
+        <w:trPr>
+          <w:cantSplit/>
+        </w:trPr>
         <w:tc>
           <w:tcPr>
             <w:tcW w:type="dxa" w:w="3515"/>
           </w:tcPr>
           <w:p>
+            <w:pPr>
+              <w:keepNext/>
+            </w:pPr>
             <w:r>
               <w:t>01-karta-situacii-i-granic.docx</w:t>
             </w:r>
@@ -1361,6 +1495,9 @@
             <w:tcW w:type="dxa" w:w="5102"/>
           </w:tcPr>
           <w:p>
+            <w:pPr>
+              <w:keepNext/>
+            </w:pPr>
             <w:r>
               <w:t>Ситуации А, Б, В, проверка G, выход «работы не приняты», границы и когда к юристу</w:t>
             </w:r>
@@ -1368,11 +1505,17 @@
         </w:tc>
       </w:tr>
       <w:tr>
+        <w:trPr>
+          <w:cantSplit/>
+        </w:trPr>
         <w:tc>
           <w:tcPr>
             <w:tcW w:type="dxa" w:w="3515"/>
           </w:tcPr>
           <w:p>
+            <w:pPr>
+              <w:keepNext/>
+            </w:pPr>
             <w:r>
               <w:t>02-proverka-i-kontrol-otveta.xlsx</w:t>
             </w:r>
@@ -1383,6 +1526,9 @@
             <w:tcW w:type="dxa" w:w="5102"/>
           </w:tcPr>
           <w:p>
+            <w:pPr>
+              <w:keepNext/>
+            </w:pPr>
             <w:r>
               <w:t>Детальная проверка по желанию, карта рисков, дата просрочки, контроль ответа заказчика</w:t>
             </w:r>
@@ -1390,11 +1536,17 @@
         </w:tc>
       </w:tr>
       <w:tr>
+        <w:trPr>
+          <w:cantSplit/>
+        </w:trPr>
         <w:tc>
           <w:tcPr>
             <w:tcW w:type="dxa" w:w="3515"/>
           </w:tcPr>
           <w:p>
+            <w:pPr>
+              <w:keepNext/>
+            </w:pPr>
             <w:r>
               <w:t>03-algoritm-dejstviy.docx</w:t>
             </w:r>
@@ -1405,6 +1557,9 @@
             <w:tcW w:type="dxa" w:w="5102"/>
           </w:tcPr>
           <w:p>
+            <w:pPr>
+              <w:keepNext/>
+            </w:pPr>
             <w:r>
               <w:t>Алгоритм: проверка G и шаги 6–12, развилки, подтверждение и следующий шаг</w:t>
             </w:r>
@@ -1412,11 +1567,17 @@
         </w:tc>
       </w:tr>
       <w:tr>
+        <w:trPr>
+          <w:cantSplit/>
+        </w:trPr>
         <w:tc>
           <w:tcPr>
             <w:tcW w:type="dxa" w:w="3515"/>
           </w:tcPr>
           <w:p>
+            <w:pPr>
+              <w:keepNext/>
+            </w:pPr>
             <w:r>
               <w:t>04-uchet-raschetov-i-otpravok.xlsx</w:t>
             </w:r>
@@ -1427,6 +1588,9 @@
             <w:tcW w:type="dxa" w:w="5102"/>
           </w:tcPr>
           <w:p>
+            <w:pPr>
+              <w:keepNext/>
+            </w:pPr>
             <w:r>
               <w:t>Взаиморасчёты: общий долг, спорная и бесспорная части раздельно; долг по актам, акт сверки, реестр передачи ваших отправлений, реестр приложений</w:t>
             </w:r>
@@ -1434,11 +1598,17 @@
         </w:tc>
       </w:tr>
       <w:tr>
+        <w:trPr>
+          <w:cantSplit/>
+        </w:trPr>
         <w:tc>
           <w:tcPr>
             <w:tcW w:type="dxa" w:w="3515"/>
           </w:tcPr>
           <w:p>
+            <w:pPr>
+              <w:keepNext/>
+            </w:pPr>
             <w:r>
               <w:t>05-peregovory-i-perenos-sroka.docx</w:t>
             </w:r>
@@ -1449,6 +1619,9 @@
             <w:tcW w:type="dxa" w:w="5102"/>
           </w:tcPr>
           <w:p>
+            <w:pPr>
+              <w:keepNext/>
+            </w:pPr>
             <w:r>
               <w:t>Протокол переговоров, соглашение о переносе срока оплаты, учёт гарантийного письма</w:t>
             </w:r>
@@ -1456,11 +1629,17 @@
         </w:tc>
       </w:tr>
       <w:tr>
+        <w:trPr>
+          <w:cantSplit/>
+        </w:trPr>
         <w:tc>
           <w:tcPr>
             <w:tcW w:type="dxa" w:w="3515"/>
           </w:tcPr>
           <w:p>
+            <w:pPr>
+              <w:keepNext/>
+            </w:pPr>
             <w:r>
               <w:t>06-uvedomlenie-o-prosrochke.docx</w:t>
             </w:r>
@@ -1471,6 +1650,9 @@
             <w:tcW w:type="dxa" w:w="5102"/>
           </w:tcPr>
           <w:p>
+            <w:pPr>
+              <w:keepNext/>
+            </w:pPr>
             <w:r>
               <w:t>Уведомление о просрочке оплаты</w:t>
             </w:r>
@@ -1478,11 +1660,17 @@
         </w:tc>
       </w:tr>
       <w:tr>
+        <w:trPr>
+          <w:cantSplit/>
+        </w:trPr>
         <w:tc>
           <w:tcPr>
             <w:tcW w:type="dxa" w:w="3515"/>
           </w:tcPr>
           <w:p>
+            <w:pPr>
+              <w:keepNext/>
+            </w:pPr>
             <w:r>
               <w:t>07-otpravka-i-dokazatelstvo.docx</w:t>
             </w:r>
@@ -1493,6 +1681,9 @@
             <w:tcW w:type="dxa" w:w="5102"/>
           </w:tcPr>
           <w:p>
+            <w:pPr>
+              <w:keepNext/>
+            </w:pPr>
             <w:r>
               <w:t>Как направить уведомление, претензию и иск и сохранить доказательство направления</w:t>
             </w:r>
@@ -1500,11 +1691,17 @@
         </w:tc>
       </w:tr>
       <w:tr>
+        <w:trPr>
+          <w:cantSplit/>
+        </w:trPr>
         <w:tc>
           <w:tcPr>
             <w:tcW w:type="dxa" w:w="3515"/>
           </w:tcPr>
           <w:p>
+            <w:pPr>
+              <w:keepNext/>
+            </w:pPr>
             <w:r>
               <w:t>08-raschet-procentov-395.xlsx</w:t>
             </w:r>
@@ -1515,6 +1712,9 @@
             <w:tcW w:type="dxa" w:w="5102"/>
           </w:tcPr>
           <w:p>
+            <w:pPr>
+              <w:keepNext/>
+            </w:pPr>
             <w:r>
               <w:t>Расчёт процентов по ст. 395 ГК РФ: несколько актов в одном расчёте (до 12), у каждого своя дата начала просрочки и свои оплаты; проценты только на бесспорную часть; итог — только при статусе «ГОТОВ»</w:t>
             </w:r>
@@ -1522,11 +1722,17 @@
         </w:tc>
       </w:tr>
       <w:tr>
+        <w:trPr>
+          <w:cantSplit/>
+        </w:trPr>
         <w:tc>
           <w:tcPr>
             <w:tcW w:type="dxa" w:w="3515"/>
           </w:tcPr>
           <w:p>
+            <w:pPr>
+              <w:keepNext/>
+            </w:pPr>
             <w:r>
               <w:t>09-pretenziya.docx</w:t>
             </w:r>
@@ -1537,6 +1743,9 @@
             <w:tcW w:type="dxa" w:w="5102"/>
           </w:tcPr>
           <w:p>
+            <w:pPr>
+              <w:keepNext/>
+            </w:pPr>
             <w:r>
               <w:t>Претензия об оплате принятых работ: бесспорный долг, проценты, приложения</w:t>
             </w:r>
@@ -1544,6 +1753,9 @@
         </w:tc>
       </w:tr>
       <w:tr>
+        <w:trPr>
+          <w:cantSplit/>
+        </w:trPr>
         <w:tc>
           <w:tcPr>
             <w:tcW w:type="dxa" w:w="3515"/>

</xml_diff>